<commit_message>
Přijaté revize ve Wordech 24099 a 21219-16
24099 měl přes 900 vložení a 500 smazání ze sledování změn, 21219-16
pár úprav tabulek. Všechny revize přijaté, sledování změn vypnuté,
komentáře zůstaly. Markdown 24099 přegenerovaný: text beze změny, zmizely
prázdné položky seznamů a rozdělené tučné úseky.

Co-Authored-By: Claude Opus 5.5 <noreply@anthropic.com>
Claude-Session: https://claude.ai/code/session_013XsG4Ss77xGbwrRyA4pUBh
</commit_message>
<xml_diff>
--- a/extrakty/doc/TC278WG4/extract_21219-16_(2020).docx
+++ b/extrakty/doc/TC278WG4/extract_21219-16_(2020).docx
@@ -1143,18 +1143,11 @@
             <w:pPr>
               <w:spacing w:after="0"/>
             </w:pPr>
-            <w:ins w:id="51" w:author="Petr Bureš" w:date="2020-01-23T10:56:00Z">
-              <w:r>
-                <w:t>Co s</w:t>
-              </w:r>
-            </w:ins>
+            <w:r>
+              <w:t>Co s</w:t>
+            </w:r>
             <w:commentRangeStart w:id="52"/>
             <w:commentRangeStart w:id="53"/>
-            <w:del w:id="54" w:author="Petr Bureš" w:date="2020-01-23T10:56:00Z">
-              <w:r>
-                <w:delText>S</w:delText>
-              </w:r>
-            </w:del>
             <w:r>
               <w:t>truktura specifikuje</w:t>
             </w:r>
@@ -1449,11 +1442,6 @@
             <w:r>
               <w:t>oblast</w:t>
             </w:r>
-            <w:del w:id="77" w:author="Petr Bureš" w:date="2020-01-23T10:58:00Z">
-              <w:r>
-                <w:delText>!</w:delText>
-              </w:r>
-            </w:del>
             <w:r>
               <w:t xml:space="preserve"> </w:t>
             </w:r>
@@ -1669,11 +1657,9 @@
             <w:r>
               <w:t xml:space="preserve">Vjezd na </w:t>
             </w:r>
-            <w:ins w:id="80" w:author="Petr Bureš" w:date="2020-01-23T10:58:00Z">
-              <w:r>
-                <w:t xml:space="preserve">čerpací </w:t>
-              </w:r>
-            </w:ins>
+            <w:r>
+              <w:t xml:space="preserve">čerpací </w:t>
+            </w:r>
             <w:r>
               <w:t>stanici</w:t>
             </w:r>
@@ -1745,11 +1731,9 @@
             <w:r>
               <w:t xml:space="preserve">poloha na </w:t>
             </w:r>
-            <w:ins w:id="83" w:author="Petr Bureš" w:date="2020-01-23T10:58:00Z">
-              <w:r>
-                <w:t xml:space="preserve">čerpací </w:t>
-              </w:r>
-            </w:ins>
+            <w:r>
+              <w:t xml:space="preserve">čerpací </w:t>
+            </w:r>
             <w:r>
               <w:t>stanice</w:t>
             </w:r>
@@ -1866,19 +1850,12 @@
             <w:r>
               <w:t>Výjezd z</w:t>
             </w:r>
-            <w:del w:id="84" w:author="Petr Bureš" w:date="2020-01-23T10:58:00Z">
-              <w:r>
-                <w:delText>e</w:delText>
-              </w:r>
-            </w:del>
             <w:r>
               <w:t xml:space="preserve"> </w:t>
             </w:r>
-            <w:ins w:id="85" w:author="Petr Bureš" w:date="2020-01-23T10:58:00Z">
-              <w:r>
-                <w:t xml:space="preserve">čerpací </w:t>
-              </w:r>
-            </w:ins>
+            <w:r>
+              <w:t xml:space="preserve">čerpací </w:t>
+            </w:r>
             <w:commentRangeStart w:id="86"/>
             <w:commentRangeStart w:id="87"/>
             <w:r>
@@ -2067,28 +2044,15 @@
             <w:r>
               <w:t xml:space="preserve">Minimální a maximální možné </w:t>
             </w:r>
-            <w:del w:id="94" w:author="Petr Bureš" w:date="2020-01-23T11:01:00Z">
-              <w:r>
-                <w:delText>čerpan</w:delText>
-              </w:r>
-              <w:r>
-                <w:delText>í</w:delText>
-              </w:r>
-              <w:r>
-                <w:delText xml:space="preserve"> </w:delText>
-              </w:r>
-            </w:del>
-            <w:ins w:id="95" w:author="Petr Bureš" w:date="2020-01-23T11:01:00Z">
-              <w:r>
-                <w:t>čerp</w:t>
-              </w:r>
-              <w:r>
-                <w:t>á</w:t>
-              </w:r>
-              <w:r>
-                <w:t xml:space="preserve">ní </w:t>
-              </w:r>
-            </w:ins>
+            <w:r>
+              <w:t>čerp</w:t>
+            </w:r>
+            <w:r>
+              <w:t>á</w:t>
+            </w:r>
+            <w:r>
+              <w:t xml:space="preserve">ní </w:t>
+            </w:r>
             <w:r>
               <w:t>množství paliva</w:t>
             </w:r>
@@ -2333,11 +2297,9 @@
             <w:r>
               <w:t xml:space="preserve">na </w:t>
             </w:r>
-            <w:ins w:id="96" w:author="Petr Bureš" w:date="2020-01-23T11:02:00Z">
-              <w:r>
-                <w:t xml:space="preserve">čerpací </w:t>
-              </w:r>
-            </w:ins>
+            <w:r>
+              <w:t xml:space="preserve">čerpací </w:t>
+            </w:r>
             <w:r>
               <w:t>stanici</w:t>
             </w:r>
@@ -2453,11 +2415,9 @@
             <w:r>
               <w:t xml:space="preserve">druhy paliva, ceny a značka paliva a subjektivní cenové hodnocení této </w:t>
             </w:r>
-            <w:ins w:id="97" w:author="Petr Bureš" w:date="2020-01-23T11:02:00Z">
-              <w:r>
-                <w:t xml:space="preserve">čerpací </w:t>
-              </w:r>
-            </w:ins>
+            <w:r>
+              <w:t xml:space="preserve">čerpací </w:t>
+            </w:r>
             <w:r>
               <w:t>stanice</w:t>
             </w:r>
@@ -2511,11 +2471,9 @@
             <w:r>
               <w:t xml:space="preserve">mapové referenční informace o poloze </w:t>
             </w:r>
-            <w:ins w:id="98" w:author="Petr Bureš" w:date="2020-01-23T11:02:00Z">
-              <w:r>
-                <w:t xml:space="preserve">čerpací </w:t>
-              </w:r>
-            </w:ins>
+            <w:r>
+              <w:t xml:space="preserve">čerpací </w:t>
+            </w:r>
             <w:r>
               <w:t>stanice</w:t>
             </w:r>
@@ -2578,11 +2536,9 @@
             <w:r>
               <w:t xml:space="preserve">umístění pro jednotlivou </w:t>
             </w:r>
-            <w:ins w:id="99" w:author="Petr Bureš" w:date="2020-01-23T11:02:00Z">
-              <w:r>
-                <w:t xml:space="preserve">čerpací </w:t>
-              </w:r>
-            </w:ins>
+            <w:r>
+              <w:t xml:space="preserve">čerpací </w:t>
+            </w:r>
             <w:r>
               <w:t>stanici podél dané RoadLocation, určené jako offset od začátku této RoadLocation</w:t>
             </w:r>
@@ -3380,13 +3336,6 @@
         <w:gridCol w:w="2954"/>
         <w:gridCol w:w="3827"/>
         <w:gridCol w:w="2279"/>
-        <w:tblGridChange w:id="100">
-          <w:tblGrid>
-            <w:gridCol w:w="2954"/>
-            <w:gridCol w:w="3686"/>
-            <w:gridCol w:w="2420"/>
-          </w:tblGrid>
-        </w:tblGridChange>
       </w:tblGrid>
       <w:tr>
         <w:tblPrEx>
@@ -3394,22 +3343,9 @@
           <w:tblInd w:w="131" w:type="dxa"/>
           <w:tblLayout w:type="fixed"/>
           <w:tblLook w:val="0000" w:firstRow="0" w:lastRow="0" w:firstColumn="0" w:lastColumn="0" w:noHBand="0" w:noVBand="0"/>
-          <w:tblPrExChange w:id="101" w:author="Petr Bureš" w:date="2020-01-23T11:03:00Z">
-            <w:tblPrEx>
-              <w:tblW w:w="0" w:type="auto"/>
-              <w:tblInd w:w="131" w:type="dxa"/>
-              <w:tblLayout w:type="fixed"/>
-              <w:tblLook w:val="0000" w:firstRow="0" w:lastRow="0" w:firstColumn="0" w:lastColumn="0" w:noHBand="0" w:noVBand="0"/>
-            </w:tblPrEx>
-          </w:tblPrExChange>
         </w:tblPrEx>
         <w:trPr>
           <w:tblHeader/>
-          <w:trPrChange w:id="102" w:author="Petr Bureš" w:date="2020-01-23T11:03:00Z">
-            <w:trPr>
-              <w:tblHeader/>
-            </w:trPr>
-          </w:trPrChange>
         </w:trPr>
         <w:tc>
           <w:tcPr>
@@ -3421,18 +3357,6 @@
               <w:right w:val="single" w:sz="4" w:space="0" w:color="000000"/>
             </w:tcBorders>
             <w:shd w:val="clear" w:color="auto" w:fill="auto"/>
-            <w:tcPrChange w:id="103" w:author="Petr Bureš" w:date="2020-01-23T11:03:00Z">
-              <w:tcPr>
-                <w:tcW w:w="2954" w:type="dxa"/>
-                <w:tcBorders>
-                  <w:top w:val="single" w:sz="4" w:space="0" w:color="auto"/>
-                  <w:left w:val="single" w:sz="4" w:space="0" w:color="000000"/>
-                  <w:bottom w:val="single" w:sz="4" w:space="0" w:color="000000"/>
-                  <w:right w:val="single" w:sz="4" w:space="0" w:color="000000"/>
-                </w:tcBorders>
-                <w:shd w:val="clear" w:color="auto" w:fill="auto"/>
-              </w:tcPr>
-            </w:tcPrChange>
           </w:tcPr>
           <w:p>
             <w:pPr>
@@ -3465,18 +3389,6 @@
               <w:right w:val="single" w:sz="4" w:space="0" w:color="000000"/>
             </w:tcBorders>
             <w:shd w:val="clear" w:color="auto" w:fill="auto"/>
-            <w:tcPrChange w:id="104" w:author="Petr Bureš" w:date="2020-01-23T11:03:00Z">
-              <w:tcPr>
-                <w:tcW w:w="3686" w:type="dxa"/>
-                <w:tcBorders>
-                  <w:top w:val="single" w:sz="4" w:space="0" w:color="auto"/>
-                  <w:left w:val="single" w:sz="4" w:space="0" w:color="000000"/>
-                  <w:bottom w:val="single" w:sz="4" w:space="0" w:color="000000"/>
-                  <w:right w:val="single" w:sz="4" w:space="0" w:color="000000"/>
-                </w:tcBorders>
-                <w:shd w:val="clear" w:color="auto" w:fill="auto"/>
-              </w:tcPr>
-            </w:tcPrChange>
           </w:tcPr>
           <w:p>
             <w:pPr>
@@ -3509,18 +3421,6 @@
               <w:right w:val="single" w:sz="4" w:space="0" w:color="000000"/>
             </w:tcBorders>
             <w:shd w:val="clear" w:color="auto" w:fill="auto"/>
-            <w:tcPrChange w:id="105" w:author="Petr Bureš" w:date="2020-01-23T11:03:00Z">
-              <w:tcPr>
-                <w:tcW w:w="2420" w:type="dxa"/>
-                <w:tcBorders>
-                  <w:top w:val="single" w:sz="4" w:space="0" w:color="auto"/>
-                  <w:left w:val="single" w:sz="4" w:space="0" w:color="000000"/>
-                  <w:bottom w:val="single" w:sz="4" w:space="0" w:color="000000"/>
-                  <w:right w:val="single" w:sz="4" w:space="0" w:color="000000"/>
-                </w:tcBorders>
-                <w:shd w:val="clear" w:color="auto" w:fill="auto"/>
-              </w:tcPr>
-            </w:tcPrChange>
           </w:tcPr>
           <w:p>
             <w:pPr>
@@ -3541,14 +3441,6 @@
           <w:tblInd w:w="131" w:type="dxa"/>
           <w:tblLayout w:type="fixed"/>
           <w:tblLook w:val="0000" w:firstRow="0" w:lastRow="0" w:firstColumn="0" w:lastColumn="0" w:noHBand="0" w:noVBand="0"/>
-          <w:tblPrExChange w:id="106" w:author="Petr Bureš" w:date="2020-01-23T11:03:00Z">
-            <w:tblPrEx>
-              <w:tblW w:w="0" w:type="auto"/>
-              <w:tblInd w:w="131" w:type="dxa"/>
-              <w:tblLayout w:type="fixed"/>
-              <w:tblLook w:val="0000" w:firstRow="0" w:lastRow="0" w:firstColumn="0" w:lastColumn="0" w:noHBand="0" w:noVBand="0"/>
-            </w:tblPrEx>
-          </w:tblPrExChange>
         </w:tblPrEx>
         <w:tc>
           <w:tcPr>
@@ -3560,18 +3452,6 @@
               <w:right w:val="single" w:sz="4" w:space="0" w:color="000000"/>
             </w:tcBorders>
             <w:shd w:val="clear" w:color="auto" w:fill="auto"/>
-            <w:tcPrChange w:id="107" w:author="Petr Bureš" w:date="2020-01-23T11:03:00Z">
-              <w:tcPr>
-                <w:tcW w:w="2954" w:type="dxa"/>
-                <w:tcBorders>
-                  <w:top w:val="single" w:sz="4" w:space="0" w:color="000000"/>
-                  <w:left w:val="single" w:sz="4" w:space="0" w:color="000000"/>
-                  <w:bottom w:val="single" w:sz="4" w:space="0" w:color="000000"/>
-                  <w:right w:val="single" w:sz="4" w:space="0" w:color="000000"/>
-                </w:tcBorders>
-                <w:shd w:val="clear" w:color="auto" w:fill="auto"/>
-              </w:tcPr>
-            </w:tcPrChange>
           </w:tcPr>
           <w:p>
             <w:pPr>
@@ -3592,18 +3472,6 @@
               <w:right w:val="single" w:sz="4" w:space="0" w:color="000000"/>
             </w:tcBorders>
             <w:shd w:val="clear" w:color="auto" w:fill="auto"/>
-            <w:tcPrChange w:id="108" w:author="Petr Bureš" w:date="2020-01-23T11:03:00Z">
-              <w:tcPr>
-                <w:tcW w:w="3686" w:type="dxa"/>
-                <w:tcBorders>
-                  <w:top w:val="single" w:sz="4" w:space="0" w:color="000000"/>
-                  <w:left w:val="single" w:sz="4" w:space="0" w:color="000000"/>
-                  <w:bottom w:val="single" w:sz="4" w:space="0" w:color="000000"/>
-                  <w:right w:val="single" w:sz="4" w:space="0" w:color="000000"/>
-                </w:tcBorders>
-                <w:shd w:val="clear" w:color="auto" w:fill="auto"/>
-              </w:tcPr>
-            </w:tcPrChange>
           </w:tcPr>
           <w:p>
             <w:pPr>
@@ -3624,18 +3492,6 @@
               <w:right w:val="single" w:sz="4" w:space="0" w:color="000000"/>
             </w:tcBorders>
             <w:shd w:val="clear" w:color="auto" w:fill="auto"/>
-            <w:tcPrChange w:id="109" w:author="Petr Bureš" w:date="2020-01-23T11:03:00Z">
-              <w:tcPr>
-                <w:tcW w:w="2420" w:type="dxa"/>
-                <w:tcBorders>
-                  <w:top w:val="single" w:sz="4" w:space="0" w:color="000000"/>
-                  <w:left w:val="single" w:sz="4" w:space="0" w:color="000000"/>
-                  <w:bottom w:val="single" w:sz="4" w:space="0" w:color="000000"/>
-                  <w:right w:val="single" w:sz="4" w:space="0" w:color="000000"/>
-                </w:tcBorders>
-                <w:shd w:val="clear" w:color="auto" w:fill="auto"/>
-              </w:tcPr>
-            </w:tcPrChange>
           </w:tcPr>
           <w:p>
             <w:pPr>
@@ -3674,14 +3530,6 @@
           <w:tblInd w:w="131" w:type="dxa"/>
           <w:tblLayout w:type="fixed"/>
           <w:tblLook w:val="0000" w:firstRow="0" w:lastRow="0" w:firstColumn="0" w:lastColumn="0" w:noHBand="0" w:noVBand="0"/>
-          <w:tblPrExChange w:id="110" w:author="Petr Bureš" w:date="2020-01-23T11:03:00Z">
-            <w:tblPrEx>
-              <w:tblW w:w="0" w:type="auto"/>
-              <w:tblInd w:w="131" w:type="dxa"/>
-              <w:tblLayout w:type="fixed"/>
-              <w:tblLook w:val="0000" w:firstRow="0" w:lastRow="0" w:firstColumn="0" w:lastColumn="0" w:noHBand="0" w:noVBand="0"/>
-            </w:tblPrEx>
-          </w:tblPrExChange>
         </w:tblPrEx>
         <w:tc>
           <w:tcPr>
@@ -3693,18 +3541,6 @@
               <w:right w:val="single" w:sz="4" w:space="0" w:color="000000"/>
             </w:tcBorders>
             <w:shd w:val="clear" w:color="auto" w:fill="auto"/>
-            <w:tcPrChange w:id="111" w:author="Petr Bureš" w:date="2020-01-23T11:03:00Z">
-              <w:tcPr>
-                <w:tcW w:w="2954" w:type="dxa"/>
-                <w:tcBorders>
-                  <w:top w:val="single" w:sz="4" w:space="0" w:color="000000"/>
-                  <w:left w:val="single" w:sz="4" w:space="0" w:color="000000"/>
-                  <w:bottom w:val="single" w:sz="4" w:space="0" w:color="000000"/>
-                  <w:right w:val="single" w:sz="4" w:space="0" w:color="000000"/>
-                </w:tcBorders>
-                <w:shd w:val="clear" w:color="auto" w:fill="auto"/>
-              </w:tcPr>
-            </w:tcPrChange>
           </w:tcPr>
           <w:p>
             <w:pPr>
@@ -3725,18 +3561,6 @@
               <w:right w:val="single" w:sz="4" w:space="0" w:color="000000"/>
             </w:tcBorders>
             <w:shd w:val="clear" w:color="auto" w:fill="auto"/>
-            <w:tcPrChange w:id="112" w:author="Petr Bureš" w:date="2020-01-23T11:03:00Z">
-              <w:tcPr>
-                <w:tcW w:w="3686" w:type="dxa"/>
-                <w:tcBorders>
-                  <w:top w:val="single" w:sz="4" w:space="0" w:color="000000"/>
-                  <w:left w:val="single" w:sz="4" w:space="0" w:color="000000"/>
-                  <w:bottom w:val="single" w:sz="4" w:space="0" w:color="000000"/>
-                  <w:right w:val="single" w:sz="4" w:space="0" w:color="000000"/>
-                </w:tcBorders>
-                <w:shd w:val="clear" w:color="auto" w:fill="auto"/>
-              </w:tcPr>
-            </w:tcPrChange>
           </w:tcPr>
           <w:p>
             <w:pPr>
@@ -3757,18 +3581,6 @@
               <w:right w:val="single" w:sz="4" w:space="0" w:color="000000"/>
             </w:tcBorders>
             <w:shd w:val="clear" w:color="auto" w:fill="auto"/>
-            <w:tcPrChange w:id="113" w:author="Petr Bureš" w:date="2020-01-23T11:03:00Z">
-              <w:tcPr>
-                <w:tcW w:w="2420" w:type="dxa"/>
-                <w:tcBorders>
-                  <w:top w:val="single" w:sz="4" w:space="0" w:color="000000"/>
-                  <w:left w:val="single" w:sz="4" w:space="0" w:color="000000"/>
-                  <w:bottom w:val="single" w:sz="4" w:space="0" w:color="000000"/>
-                  <w:right w:val="single" w:sz="4" w:space="0" w:color="000000"/>
-                </w:tcBorders>
-                <w:shd w:val="clear" w:color="auto" w:fill="auto"/>
-              </w:tcPr>
-            </w:tcPrChange>
           </w:tcPr>
           <w:p>
             <w:pPr>
@@ -3807,14 +3619,6 @@
           <w:tblInd w:w="131" w:type="dxa"/>
           <w:tblLayout w:type="fixed"/>
           <w:tblLook w:val="0000" w:firstRow="0" w:lastRow="0" w:firstColumn="0" w:lastColumn="0" w:noHBand="0" w:noVBand="0"/>
-          <w:tblPrExChange w:id="114" w:author="Petr Bureš" w:date="2020-01-23T11:03:00Z">
-            <w:tblPrEx>
-              <w:tblW w:w="0" w:type="auto"/>
-              <w:tblInd w:w="131" w:type="dxa"/>
-              <w:tblLayout w:type="fixed"/>
-              <w:tblLook w:val="0000" w:firstRow="0" w:lastRow="0" w:firstColumn="0" w:lastColumn="0" w:noHBand="0" w:noVBand="0"/>
-            </w:tblPrEx>
-          </w:tblPrExChange>
         </w:tblPrEx>
         <w:tc>
           <w:tcPr>
@@ -3826,18 +3630,6 @@
               <w:right w:val="single" w:sz="4" w:space="0" w:color="000000"/>
             </w:tcBorders>
             <w:shd w:val="clear" w:color="auto" w:fill="auto"/>
-            <w:tcPrChange w:id="115" w:author="Petr Bureš" w:date="2020-01-23T11:03:00Z">
-              <w:tcPr>
-                <w:tcW w:w="2954" w:type="dxa"/>
-                <w:tcBorders>
-                  <w:top w:val="single" w:sz="4" w:space="0" w:color="000000"/>
-                  <w:left w:val="single" w:sz="4" w:space="0" w:color="000000"/>
-                  <w:bottom w:val="single" w:sz="4" w:space="0" w:color="000000"/>
-                  <w:right w:val="single" w:sz="4" w:space="0" w:color="000000"/>
-                </w:tcBorders>
-                <w:shd w:val="clear" w:color="auto" w:fill="auto"/>
-              </w:tcPr>
-            </w:tcPrChange>
           </w:tcPr>
           <w:p>
             <w:pPr>
@@ -3858,18 +3650,6 @@
               <w:right w:val="single" w:sz="4" w:space="0" w:color="000000"/>
             </w:tcBorders>
             <w:shd w:val="clear" w:color="auto" w:fill="auto"/>
-            <w:tcPrChange w:id="116" w:author="Petr Bureš" w:date="2020-01-23T11:03:00Z">
-              <w:tcPr>
-                <w:tcW w:w="3686" w:type="dxa"/>
-                <w:tcBorders>
-                  <w:top w:val="single" w:sz="4" w:space="0" w:color="000000"/>
-                  <w:left w:val="single" w:sz="4" w:space="0" w:color="000000"/>
-                  <w:bottom w:val="single" w:sz="4" w:space="0" w:color="000000"/>
-                  <w:right w:val="single" w:sz="4" w:space="0" w:color="000000"/>
-                </w:tcBorders>
-                <w:shd w:val="clear" w:color="auto" w:fill="auto"/>
-              </w:tcPr>
-            </w:tcPrChange>
           </w:tcPr>
           <w:p>
             <w:pPr>
@@ -3890,18 +3670,6 @@
               <w:right w:val="single" w:sz="4" w:space="0" w:color="000000"/>
             </w:tcBorders>
             <w:shd w:val="clear" w:color="auto" w:fill="auto"/>
-            <w:tcPrChange w:id="117" w:author="Petr Bureš" w:date="2020-01-23T11:03:00Z">
-              <w:tcPr>
-                <w:tcW w:w="2420" w:type="dxa"/>
-                <w:tcBorders>
-                  <w:top w:val="single" w:sz="4" w:space="0" w:color="000000"/>
-                  <w:left w:val="single" w:sz="4" w:space="0" w:color="000000"/>
-                  <w:bottom w:val="single" w:sz="4" w:space="0" w:color="000000"/>
-                  <w:right w:val="single" w:sz="4" w:space="0" w:color="000000"/>
-                </w:tcBorders>
-                <w:shd w:val="clear" w:color="auto" w:fill="auto"/>
-              </w:tcPr>
-            </w:tcPrChange>
           </w:tcPr>
           <w:p>
             <w:pPr>
@@ -3928,22 +3696,9 @@
           <w:tblInd w:w="131" w:type="dxa"/>
           <w:tblLayout w:type="fixed"/>
           <w:tblLook w:val="0000" w:firstRow="0" w:lastRow="0" w:firstColumn="0" w:lastColumn="0" w:noHBand="0" w:noVBand="0"/>
-          <w:tblPrExChange w:id="101" w:author="Petr Bureš" w:date="2020-01-23T11:03:00Z">
-            <w:tblPrEx>
-              <w:tblW w:w="0" w:type="auto"/>
-              <w:tblInd w:w="131" w:type="dxa"/>
-              <w:tblLayout w:type="fixed"/>
-              <w:tblLook w:val="0000" w:firstRow="0" w:lastRow="0" w:firstColumn="0" w:lastColumn="0" w:noHBand="0" w:noVBand="0"/>
-            </w:tblPrEx>
-          </w:tblPrExChange>
         </w:tblPrEx>
         <w:trPr>
           <w:tblHeader/>
-          <w:trPrChange w:id="102" w:author="Petr Bureš" w:date="2020-01-23T11:03:00Z">
-            <w:trPr>
-              <w:tblHeader/>
-            </w:trPr>
-          </w:trPrChange>
         </w:trPr>
         <w:tc>
           <w:tcPr>
@@ -3955,18 +3710,6 @@
               <w:right w:val="single" w:sz="4" w:space="0" w:color="000000"/>
             </w:tcBorders>
             <w:shd w:val="clear" w:color="auto" w:fill="auto"/>
-            <w:tcPrChange w:id="103" w:author="Petr Bureš" w:date="2020-01-23T11:03:00Z">
-              <w:tcPr>
-                <w:tcW w:w="2954" w:type="dxa"/>
-                <w:tcBorders>
-                  <w:top w:val="single" w:sz="4" w:space="0" w:color="auto"/>
-                  <w:left w:val="single" w:sz="4" w:space="0" w:color="000000"/>
-                  <w:bottom w:val="single" w:sz="4" w:space="0" w:color="000000"/>
-                  <w:right w:val="single" w:sz="4" w:space="0" w:color="000000"/>
-                </w:tcBorders>
-                <w:shd w:val="clear" w:color="auto" w:fill="auto"/>
-              </w:tcPr>
-            </w:tcPrChange>
           </w:tcPr>
           <w:p>
             <w:pPr>
@@ -3990,18 +3733,6 @@
               <w:right w:val="single" w:sz="4" w:space="0" w:color="000000"/>
             </w:tcBorders>
             <w:shd w:val="clear" w:color="auto" w:fill="auto"/>
-            <w:tcPrChange w:id="104" w:author="Petr Bureš" w:date="2020-01-23T11:03:00Z">
-              <w:tcPr>
-                <w:tcW w:w="3686" w:type="dxa"/>
-                <w:tcBorders>
-                  <w:top w:val="single" w:sz="4" w:space="0" w:color="auto"/>
-                  <w:left w:val="single" w:sz="4" w:space="0" w:color="000000"/>
-                  <w:bottom w:val="single" w:sz="4" w:space="0" w:color="000000"/>
-                  <w:right w:val="single" w:sz="4" w:space="0" w:color="000000"/>
-                </w:tcBorders>
-                <w:shd w:val="clear" w:color="auto" w:fill="auto"/>
-              </w:tcPr>
-            </w:tcPrChange>
           </w:tcPr>
           <w:p>
             <w:pPr>
@@ -4022,18 +3753,6 @@
               <w:right w:val="single" w:sz="4" w:space="0" w:color="000000"/>
             </w:tcBorders>
             <w:shd w:val="clear" w:color="auto" w:fill="auto"/>
-            <w:tcPrChange w:id="105" w:author="Petr Bureš" w:date="2020-01-23T11:03:00Z">
-              <w:tcPr>
-                <w:tcW w:w="2420" w:type="dxa"/>
-                <w:tcBorders>
-                  <w:top w:val="single" w:sz="4" w:space="0" w:color="auto"/>
-                  <w:left w:val="single" w:sz="4" w:space="0" w:color="000000"/>
-                  <w:bottom w:val="single" w:sz="4" w:space="0" w:color="000000"/>
-                  <w:right w:val="single" w:sz="4" w:space="0" w:color="000000"/>
-                </w:tcBorders>
-                <w:shd w:val="clear" w:color="auto" w:fill="auto"/>
-              </w:tcPr>
-            </w:tcPrChange>
           </w:tcPr>
           <w:p>
             <w:pPr>
@@ -4048,22 +3767,9 @@
           <w:tblInd w:w="131" w:type="dxa"/>
           <w:tblLayout w:type="fixed"/>
           <w:tblLook w:val="0000" w:firstRow="0" w:lastRow="0" w:firstColumn="0" w:lastColumn="0" w:noHBand="0" w:noVBand="0"/>
-          <w:tblPrExChange w:id="145" w:author="Petr Bureš" w:date="2020-01-23T11:03:00Z">
-            <w:tblPrEx>
-              <w:tblW w:w="0" w:type="auto"/>
-              <w:tblInd w:w="131" w:type="dxa"/>
-              <w:tblLayout w:type="fixed"/>
-              <w:tblLook w:val="0000" w:firstRow="0" w:lastRow="0" w:firstColumn="0" w:lastColumn="0" w:noHBand="0" w:noVBand="0"/>
-            </w:tblPrEx>
-          </w:tblPrExChange>
         </w:tblPrEx>
         <w:trPr>
           <w:trHeight w:val="70"/>
-          <w:trPrChange w:id="146" w:author="Petr Bureš" w:date="2020-01-23T11:03:00Z">
-            <w:trPr>
-              <w:trHeight w:val="70"/>
-            </w:trPr>
-          </w:trPrChange>
         </w:trPr>
         <w:tc>
           <w:tcPr>
@@ -4075,18 +3781,6 @@
               <w:right w:val="single" w:sz="4" w:space="0" w:color="000000"/>
             </w:tcBorders>
             <w:shd w:val="clear" w:color="auto" w:fill="auto"/>
-            <w:tcPrChange w:id="147" w:author="Petr Bureš" w:date="2020-01-23T11:03:00Z">
-              <w:tcPr>
-                <w:tcW w:w="2954" w:type="dxa"/>
-                <w:tcBorders>
-                  <w:top w:val="single" w:sz="4" w:space="0" w:color="000000"/>
-                  <w:left w:val="single" w:sz="4" w:space="0" w:color="000000"/>
-                  <w:bottom w:val="single" w:sz="4" w:space="0" w:color="000000"/>
-                  <w:right w:val="single" w:sz="4" w:space="0" w:color="000000"/>
-                </w:tcBorders>
-                <w:shd w:val="clear" w:color="auto" w:fill="auto"/>
-              </w:tcPr>
-            </w:tcPrChange>
           </w:tcPr>
           <w:p>
             <w:pPr>
@@ -4107,18 +3801,6 @@
               <w:right w:val="single" w:sz="4" w:space="0" w:color="000000"/>
             </w:tcBorders>
             <w:shd w:val="clear" w:color="auto" w:fill="auto"/>
-            <w:tcPrChange w:id="148" w:author="Petr Bureš" w:date="2020-01-23T11:03:00Z">
-              <w:tcPr>
-                <w:tcW w:w="3686" w:type="dxa"/>
-                <w:tcBorders>
-                  <w:top w:val="single" w:sz="4" w:space="0" w:color="000000"/>
-                  <w:left w:val="single" w:sz="4" w:space="0" w:color="000000"/>
-                  <w:bottom w:val="single" w:sz="4" w:space="0" w:color="000000"/>
-                  <w:right w:val="single" w:sz="4" w:space="0" w:color="000000"/>
-                </w:tcBorders>
-                <w:shd w:val="clear" w:color="auto" w:fill="auto"/>
-              </w:tcPr>
-            </w:tcPrChange>
           </w:tcPr>
           <w:p>
             <w:pPr>
@@ -4148,11 +3830,9 @@
               </w:rPr>
               <w:commentReference w:id="150"/>
             </w:r>
-            <w:ins w:id="151" w:author="Petr Bureš" w:date="2020-01-23T11:04:00Z">
-              <w:r>
-                <w:t xml:space="preserve">jsou </w:t>
-              </w:r>
-            </w:ins>
+            <w:r>
+              <w:t xml:space="preserve">jsou </w:t>
+            </w:r>
             <w:r>
               <w:t>pouze 2</w:t>
             </w:r>
@@ -4168,18 +3848,6 @@
               <w:right w:val="single" w:sz="4" w:space="0" w:color="000000"/>
             </w:tcBorders>
             <w:shd w:val="clear" w:color="auto" w:fill="auto"/>
-            <w:tcPrChange w:id="152" w:author="Petr Bureš" w:date="2020-01-23T11:03:00Z">
-              <w:tcPr>
-                <w:tcW w:w="2420" w:type="dxa"/>
-                <w:tcBorders>
-                  <w:top w:val="single" w:sz="4" w:space="0" w:color="000000"/>
-                  <w:left w:val="single" w:sz="4" w:space="0" w:color="000000"/>
-                  <w:bottom w:val="single" w:sz="4" w:space="0" w:color="000000"/>
-                  <w:right w:val="single" w:sz="4" w:space="0" w:color="000000"/>
-                </w:tcBorders>
-                <w:shd w:val="clear" w:color="auto" w:fill="auto"/>
-              </w:tcPr>
-            </w:tcPrChange>
           </w:tcPr>
           <w:p>
             <w:pPr>

</xml_diff>